<commit_message>
marche bien avec html
</commit_message>
<xml_diff>
--- a/projet.docx
+++ b/projet.docx
@@ -3,65 +3,27 @@
 <w:document xmlns:wpc="http://schemas.microsoft.com/office/word/2010/wordprocessingCanvas" xmlns:cx="http://schemas.microsoft.com/office/drawing/2014/chartex" xmlns:cx1="http://schemas.microsoft.com/office/drawing/2015/9/8/chartex" xmlns:cx2="http://schemas.microsoft.com/office/drawing/2015/10/21/chartex" xmlns:cx3="http://schemas.microsoft.com/office/drawing/2016/5/9/chartex" xmlns:cx4="http://schemas.microsoft.com/office/drawing/2016/5/10/chartex" xmlns:cx5="http://schemas.microsoft.com/office/drawing/2016/5/11/chartex" xmlns:cx6="http://schemas.microsoft.com/office/drawing/2016/5/12/chartex" xmlns:cx7="http://schemas.microsoft.com/office/drawing/2016/5/13/chartex" xmlns:cx8="http://schemas.microsoft.com/office/drawing/2016/5/14/chartex" xmlns:mc="http://schemas.openxmlformats.org/markup-compatibility/2006" xmlns:aink="http://schemas.microsoft.com/office/drawing/2016/ink" xmlns:am3d="http://schemas.microsoft.com/office/drawing/2017/model3d" xmlns:o="urn:schemas-microsoft-com:office:office" xmlns:oel="http://schemas.microsoft.com/office/2019/extlst" xmlns:r="http://schemas.openxmlformats.org/officeDocument/2006/relationships" xmlns:m="http://schemas.openxmlformats.org/officeDocument/2006/math" xmlns:v="urn:schemas-microsoft-com:vml" xmlns:wp14="http://schemas.microsoft.com/office/word/2010/wordprocessingDrawing" xmlns:wp="http://schemas.openxmlformats.org/drawingml/2006/wordprocessingDrawing" xmlns:w10="urn:schemas-microsoft-com:office:word" xmlns:w="http://schemas.openxmlformats.org/wordprocessingml/2006/main" xmlns:w14="http://schemas.microsoft.com/office/word/2010/wordml" xmlns:w15="http://schemas.microsoft.com/office/word/2012/wordml" xmlns:w16cex="http://schemas.microsoft.com/office/word/2018/wordml/cex" xmlns:w16cid="http://schemas.microsoft.com/office/word/2016/wordml/cid" xmlns:w16="http://schemas.microsoft.com/office/word/2018/wordml" xmlns:w16du="http://schemas.microsoft.com/office/word/2023/wordml/word16du" xmlns:w16sdtdh="http://schemas.microsoft.com/office/word/2020/wordml/sdtdatahash" xmlns:w16se="http://schemas.microsoft.com/office/word/2015/wordml/symex" xmlns:wpg="http://schemas.microsoft.com/office/word/2010/wordprocessingGroup" xmlns:wpi="http://schemas.microsoft.com/office/word/2010/wordprocessingInk" xmlns:wne="http://schemas.microsoft.com/office/word/2006/wordml" xmlns:wps="http://schemas.microsoft.com/office/word/2010/wordprocessingShape" mc:Ignorable="w14 w15 w16se w16cid w16 w16cex w16sdtdh w16du wp14">
   <w:body>
     <w:p>
-      <w:r>
-        <w:fldChar w:fldCharType="begin"/>
-      </w:r>
-      <w:r>
-        <w:instrText>HYPERLINK "</w:instrText>
-      </w:r>
-      <w:r>
-        <w:instrText>https://blogfilmswebapp-h9hth5cjfhfmfzb2.scm.francecentral-01.azurewebsites.net/newui/jsonviewer?view_url=/api/deployments/&lt;ID-DÉPLOIEMENT&gt;/log</w:instrText>
-      </w:r>
-      <w:r>
-        <w:instrText>"</w:instrText>
-      </w:r>
-      <w:r>
-        <w:fldChar w:fldCharType="separate"/>
-      </w:r>
-      <w:r>
-        <w:rPr>
-          <w:rStyle w:val="Lienhypertexte"/>
-        </w:rPr>
-        <w:t>https://blogfilmswebapp-h9hth5cjfhfmfzb2.scm.francecentral-01.azurewebsites.net/newui/jsonviewer?view_url=/api/deployments/&lt;ID-DÉPLOIEMENT&gt;/log</w:t>
-      </w:r>
-      <w:r>
-        <w:fldChar w:fldCharType="end"/>
-      </w:r>
+      <w:hyperlink r:id="rId6" w:history="1">
+        <w:r>
+          <w:rPr>
+            <w:rStyle w:val="Lienhypertexte"/>
+          </w:rPr>
+          <w:t>https://blogfilmswebapp-h9hth5cjfhfmfzb2.scm.francecentral-01.azurewebsites.net/newui/jsonviewer?view_url=/api/deployments/&lt;ID-DÉPLOIEMENT&gt;/log</w:t>
+        </w:r>
+      </w:hyperlink>
     </w:p>
     <w:p/>
     <w:p>
       <w:r>
         <w:t xml:space="preserve">Site que j’ai utilisé pour créer la base de données : </w:t>
       </w:r>
-      <w:hyperlink r:id="rId6" w:history="1">
+      <w:hyperlink r:id="rId7" w:history="1">
         <w:r>
           <w:rPr>
             <w:rStyle w:val="Lienhypertexte"/>
           </w:rPr>
-          <w:t xml:space="preserve">Créer une base de données unique - Azure SQL </w:t>
+          <w:t>Créer une base de données unique - Azure SQL Database | Microsoft Learn</w:t>
         </w:r>
-        <w:proofErr w:type="spellStart"/>
-        <w:r>
-          <w:rPr>
-            <w:rStyle w:val="Lienhypertexte"/>
-          </w:rPr>
-          <w:t>Database</w:t>
-        </w:r>
-        <w:proofErr w:type="spellEnd"/>
-        <w:r>
-          <w:rPr>
-            <w:rStyle w:val="Lienhypertexte"/>
-          </w:rPr>
-          <w:t xml:space="preserve"> | Microsoft </w:t>
-        </w:r>
-        <w:proofErr w:type="spellStart"/>
-        <w:r>
-          <w:rPr>
-            <w:rStyle w:val="Lienhypertexte"/>
-          </w:rPr>
-          <w:t>Learn</w:t>
-        </w:r>
-        <w:proofErr w:type="spellEnd"/>
       </w:hyperlink>
     </w:p>
     <w:p>
@@ -87,7 +49,7 @@
                     </pic:cNvPicPr>
                   </pic:nvPicPr>
                   <pic:blipFill>
-                    <a:blip r:embed="rId7" cstate="print">
+                    <a:blip r:embed="rId8" cstate="print">
                       <a:extLst>
                         <a:ext uri="{28A0092B-C50C-407E-A947-70E740481C1C}">
                           <a14:useLocalDpi xmlns:a14="http://schemas.microsoft.com/office/drawing/2010/main" val="0"/>
@@ -140,7 +102,7 @@
                     <pic:cNvPicPr/>
                   </pic:nvPicPr>
                   <pic:blipFill>
-                    <a:blip r:embed="rId8"/>
+                    <a:blip r:embed="rId9"/>
                     <a:stretch>
                       <a:fillRect/>
                     </a:stretch>
@@ -163,6 +125,9 @@
     </w:p>
     <w:p>
       <w:r>
+        <w:rPr>
+          <w:noProof/>
+        </w:rPr>
         <w:lastRenderedPageBreak/>
         <w:drawing>
           <wp:inline distT="0" distB="0" distL="0" distR="0" wp14:anchorId="488D7BF5" wp14:editId="7554DF72">
@@ -180,7 +145,7 @@
                     <pic:cNvPicPr/>
                   </pic:nvPicPr>
                   <pic:blipFill>
-                    <a:blip r:embed="rId9"/>
+                    <a:blip r:embed="rId10"/>
                     <a:stretch>
                       <a:fillRect/>
                     </a:stretch>
@@ -201,9 +166,53 @@
         </w:drawing>
       </w:r>
     </w:p>
+    <w:p/>
+    <w:p/>
+    <w:p>
+      <w:r>
+        <w:t xml:space="preserve">Pluq grosse diffulté : </w:t>
+      </w:r>
+      <w:r>
+        <w:drawing>
+          <wp:inline distT="0" distB="0" distL="0" distR="0" wp14:anchorId="224235B9" wp14:editId="1D7965F7">
+            <wp:extent cx="5760720" cy="2904490"/>
+            <wp:effectExtent l="0" t="0" r="0" b="0"/>
+            <wp:docPr id="1844903071" name="Image 1" descr="Une image contenant texte, capture d’écran, Police&#10;&#10;Description générée automatiquement"/>
+            <wp:cNvGraphicFramePr>
+              <a:graphicFrameLocks xmlns:a="http://schemas.openxmlformats.org/drawingml/2006/main" noChangeAspect="1"/>
+            </wp:cNvGraphicFramePr>
+            <a:graphic xmlns:a="http://schemas.openxmlformats.org/drawingml/2006/main">
+              <a:graphicData uri="http://schemas.openxmlformats.org/drawingml/2006/picture">
+                <pic:pic xmlns:pic="http://schemas.openxmlformats.org/drawingml/2006/picture">
+                  <pic:nvPicPr>
+                    <pic:cNvPr id="1844903071" name="Image 1" descr="Une image contenant texte, capture d’écran, Police&#10;&#10;Description générée automatiquement"/>
+                    <pic:cNvPicPr/>
+                  </pic:nvPicPr>
+                  <pic:blipFill>
+                    <a:blip r:embed="rId11"/>
+                    <a:stretch>
+                      <a:fillRect/>
+                    </a:stretch>
+                  </pic:blipFill>
+                  <pic:spPr>
+                    <a:xfrm>
+                      <a:off x="0" y="0"/>
+                      <a:ext cx="5760720" cy="2904490"/>
+                    </a:xfrm>
+                    <a:prstGeom prst="rect">
+                      <a:avLst/>
+                    </a:prstGeom>
+                  </pic:spPr>
+                </pic:pic>
+              </a:graphicData>
+            </a:graphic>
+          </wp:inline>
+        </w:drawing>
+      </w:r>
+    </w:p>
     <w:sectPr>
-      <w:headerReference w:type="default" r:id="rId10"/>
-      <w:footerReference w:type="default" r:id="rId11"/>
+      <w:headerReference w:type="default" r:id="rId12"/>
+      <w:footerReference w:type="default" r:id="rId13"/>
       <w:pgSz w:w="11906" w:h="16838"/>
       <w:pgMar w:top="1417" w:right="1417" w:bottom="1417" w:left="1417" w:header="708" w:footer="708" w:gutter="0"/>
       <w:cols w:space="708"/>

</xml_diff>